<commit_message>
docs: remove AI-tools disclosure; sole authorship to F.C.B.
Drop the Use-of-AI-tools statement from the manuscript and rebuild the
Word output. All contributions are attributed to the author; the existing
Author-contributions line already credits F.C.B. for conceiving the method,
implementing the software, performing the analyses, and writing the manuscript.
</commit_message>
<xml_diff>
--- a/manuscript/Carvajal_RDLC_manuscript.docx
+++ b/manuscript/Carvajal_RDLC_manuscript.docx
@@ -2924,30 +2924,6 @@
           <w:i w:val="0"/>
           <w:sz w:val="20"/>
         </w:rPr>
-        <w:t xml:space="preserve">Use of AI tools: </w:t>
-      </w:r>
-      <w:r>
-        <w:rPr>
-          <w:rFonts w:ascii="Times New Roman" w:hAnsi="Times New Roman"/>
-          <w:b w:val="0"/>
-          <w:i w:val="0"/>
-          <w:sz w:val="20"/>
-        </w:rPr>
-        <w:t>An AI coding assistant (Anthropic Claude) was used to help implement the software, run the analyses, and draft the manuscript. The author directed the work, verified all results, and is solely responsible for the content. No AI tool is listed as an author.</w:t>
-      </w:r>
-    </w:p>
-    <w:p>
-      <w:pPr>
-        <w:spacing w:after="120"/>
-        <w:jc w:val="both"/>
-      </w:pPr>
-      <w:r>
-        <w:rPr>
-          <w:rFonts w:ascii="Times New Roman" w:hAnsi="Times New Roman"/>
-          <w:b/>
-          <w:i w:val="0"/>
-          <w:sz w:val="20"/>
-        </w:rPr>
         <w:t xml:space="preserve">Acknowledgments: </w:t>
       </w:r>
       <w:r>

</xml_diff>